<commit_message>
Add New PM Plan
</commit_message>
<xml_diff>
--- a/templates/pmp-plan-template.docx
+++ b/templates/pmp-plan-template.docx
@@ -1705,6 +1705,1706 @@
         <w:t xml:space="preserve">R = Responsible, A = Accountable, C = Consulted, I = Informed</w:t>
       </w:r>
     </w:p>
+    <w:p>
+      <w:pPr>
+        <w:pStyle w:val="Heading1"/>
+        <w:pBdr>
+          <w:bottom w:val="single" w:color="1F3864" w:sz="6" w:space="4"/>
+        </w:pBdr>
+        <w:spacing w:after="160" w:before="320"/>
+      </w:pPr>
+      <w:r>
+        <w:rPr>
+          <w:b/>
+          <w:bCs/>
+          <w:color w:val="1F3864"/>
+          <w:sz w:val="28"/>
+          <w:szCs w:val="28"/>
+        </w:rPr>
+        <w:t xml:space="preserve">9. Risk &amp; Issue Management</w:t>
+      </w:r>
+    </w:p>
+    <w:p>
+      <w:pPr>
+        <w:spacing w:after="120" w:before="160"/>
+      </w:pPr>
+      <w:r>
+        <w:rPr>
+          <w:i/>
+          <w:iCs/>
+          <w:color w:val="666666"/>
+        </w:rPr>
+        <w:t xml:space="preserve">Risk Score = Probability x Impact (Low=1, Medium=2, High=3). 1-2 Low, 3-4 Medium, 6-9 High. Sourced from the Risk Register.</w:t>
+      </w:r>
+    </w:p>
+    <w:tbl>
+      <w:tblPr>
+        <w:tblW w:type="dxa" w:w="9000"/>
+        <w:tblBorders>
+          <w:top w:val="single" w:color="auto" w:sz="4"/>
+          <w:left w:val="single" w:color="auto" w:sz="4"/>
+          <w:bottom w:val="single" w:color="auto" w:sz="4"/>
+          <w:right w:val="single" w:color="auto" w:sz="4"/>
+          <w:insideH w:val="single" w:color="auto" w:sz="4"/>
+          <w:insideV w:val="single" w:color="auto" w:sz="4"/>
+        </w:tblBorders>
+      </w:tblPr>
+      <w:tblGrid>
+        <w:gridCol w:w="450"/>
+        <w:gridCol w:w="700"/>
+        <w:gridCol w:w="2200"/>
+        <w:gridCol w:w="850"/>
+        <w:gridCol w:w="750"/>
+        <w:gridCol w:w="650"/>
+        <w:gridCol w:w="1800"/>
+        <w:gridCol w:w="850"/>
+        <w:gridCol w:w="750"/>
+      </w:tblGrid>
+      <w:tr>
+        <w:tc>
+          <w:tcPr>
+            <w:tcW w:type="dxa" w:w="450"/>
+            <w:shd w:fill="1F3864" w:color="auto" w:val="clear"/>
+            <w:tcMar>
+              <w:top w:type="dxa" w:w="80"/>
+              <w:left w:type="dxa" w:w="100"/>
+              <w:bottom w:type="dxa" w:w="80"/>
+              <w:right w:type="dxa" w:w="100"/>
+            </w:tcMar>
+          </w:tcPr>
+          <w:p>
+            <w:r>
+              <w:rPr>
+                <w:b/>
+                <w:bCs/>
+                <w:i w:val="false"/>
+                <w:iCs w:val="false"/>
+                <w:color w:val="FFFFFF"/>
+              </w:rPr>
+              <w:t xml:space="preserve">#</w:t>
+            </w:r>
+          </w:p>
+        </w:tc>
+        <w:tc>
+          <w:tcPr>
+            <w:tcW w:type="dxa" w:w="700"/>
+            <w:shd w:fill="1F3864" w:color="auto" w:val="clear"/>
+            <w:tcMar>
+              <w:top w:type="dxa" w:w="80"/>
+              <w:left w:type="dxa" w:w="100"/>
+              <w:bottom w:type="dxa" w:w="80"/>
+              <w:right w:type="dxa" w:w="100"/>
+            </w:tcMar>
+          </w:tcPr>
+          <w:p>
+            <w:r>
+              <w:rPr>
+                <w:b/>
+                <w:bCs/>
+                <w:i w:val="false"/>
+                <w:iCs w:val="false"/>
+                <w:color w:val="FFFFFF"/>
+              </w:rPr>
+              <w:t xml:space="preserve">Type</w:t>
+            </w:r>
+          </w:p>
+        </w:tc>
+        <w:tc>
+          <w:tcPr>
+            <w:tcW w:type="dxa" w:w="2200"/>
+            <w:shd w:fill="1F3864" w:color="auto" w:val="clear"/>
+            <w:tcMar>
+              <w:top w:type="dxa" w:w="80"/>
+              <w:left w:type="dxa" w:w="100"/>
+              <w:bottom w:type="dxa" w:w="80"/>
+              <w:right w:type="dxa" w:w="100"/>
+            </w:tcMar>
+          </w:tcPr>
+          <w:p>
+            <w:r>
+              <w:rPr>
+                <w:b/>
+                <w:bCs/>
+                <w:i w:val="false"/>
+                <w:iCs w:val="false"/>
+                <w:color w:val="FFFFFF"/>
+              </w:rPr>
+              <w:t xml:space="preserve">Description</w:t>
+            </w:r>
+          </w:p>
+        </w:tc>
+        <w:tc>
+          <w:tcPr>
+            <w:tcW w:type="dxa" w:w="850"/>
+            <w:shd w:fill="1F3864" w:color="auto" w:val="clear"/>
+            <w:tcMar>
+              <w:top w:type="dxa" w:w="80"/>
+              <w:left w:type="dxa" w:w="100"/>
+              <w:bottom w:type="dxa" w:w="80"/>
+              <w:right w:type="dxa" w:w="100"/>
+            </w:tcMar>
+          </w:tcPr>
+          <w:p>
+            <w:r>
+              <w:rPr>
+                <w:b/>
+                <w:bCs/>
+                <w:i w:val="false"/>
+                <w:iCs w:val="false"/>
+                <w:color w:val="FFFFFF"/>
+              </w:rPr>
+              <w:t xml:space="preserve">Probability</w:t>
+            </w:r>
+          </w:p>
+        </w:tc>
+        <w:tc>
+          <w:tcPr>
+            <w:tcW w:type="dxa" w:w="750"/>
+            <w:shd w:fill="1F3864" w:color="auto" w:val="clear"/>
+            <w:tcMar>
+              <w:top w:type="dxa" w:w="80"/>
+              <w:left w:type="dxa" w:w="100"/>
+              <w:bottom w:type="dxa" w:w="80"/>
+              <w:right w:type="dxa" w:w="100"/>
+            </w:tcMar>
+          </w:tcPr>
+          <w:p>
+            <w:r>
+              <w:rPr>
+                <w:b/>
+                <w:bCs/>
+                <w:i w:val="false"/>
+                <w:iCs w:val="false"/>
+                <w:color w:val="FFFFFF"/>
+              </w:rPr>
+              <w:t xml:space="preserve">Impact</w:t>
+            </w:r>
+          </w:p>
+        </w:tc>
+        <w:tc>
+          <w:tcPr>
+            <w:tcW w:type="dxa" w:w="650"/>
+            <w:shd w:fill="1F3864" w:color="auto" w:val="clear"/>
+            <w:tcMar>
+              <w:top w:type="dxa" w:w="80"/>
+              <w:left w:type="dxa" w:w="100"/>
+              <w:bottom w:type="dxa" w:w="80"/>
+              <w:right w:type="dxa" w:w="100"/>
+            </w:tcMar>
+          </w:tcPr>
+          <w:p>
+            <w:r>
+              <w:rPr>
+                <w:b/>
+                <w:bCs/>
+                <w:i w:val="false"/>
+                <w:iCs w:val="false"/>
+                <w:color w:val="FFFFFF"/>
+              </w:rPr>
+              <w:t xml:space="preserve">Score</w:t>
+            </w:r>
+          </w:p>
+        </w:tc>
+        <w:tc>
+          <w:tcPr>
+            <w:tcW w:type="dxa" w:w="1800"/>
+            <w:shd w:fill="1F3864" w:color="auto" w:val="clear"/>
+            <w:tcMar>
+              <w:top w:type="dxa" w:w="80"/>
+              <w:left w:type="dxa" w:w="100"/>
+              <w:bottom w:type="dxa" w:w="80"/>
+              <w:right w:type="dxa" w:w="100"/>
+            </w:tcMar>
+          </w:tcPr>
+          <w:p>
+            <w:r>
+              <w:rPr>
+                <w:b/>
+                <w:bCs/>
+                <w:i w:val="false"/>
+                <w:iCs w:val="false"/>
+                <w:color w:val="FFFFFF"/>
+              </w:rPr>
+              <w:t xml:space="preserve">Response / Mitigation</w:t>
+            </w:r>
+          </w:p>
+        </w:tc>
+        <w:tc>
+          <w:tcPr>
+            <w:tcW w:type="dxa" w:w="850"/>
+            <w:shd w:fill="1F3864" w:color="auto" w:val="clear"/>
+            <w:tcMar>
+              <w:top w:type="dxa" w:w="80"/>
+              <w:left w:type="dxa" w:w="100"/>
+              <w:bottom w:type="dxa" w:w="80"/>
+              <w:right w:type="dxa" w:w="100"/>
+            </w:tcMar>
+          </w:tcPr>
+          <w:p>
+            <w:r>
+              <w:rPr>
+                <w:b/>
+                <w:bCs/>
+                <w:i w:val="false"/>
+                <w:iCs w:val="false"/>
+                <w:color w:val="FFFFFF"/>
+              </w:rPr>
+              <w:t xml:space="preserve">Owner</w:t>
+            </w:r>
+          </w:p>
+        </w:tc>
+        <w:tc>
+          <w:tcPr>
+            <w:tcW w:type="dxa" w:w="750"/>
+            <w:shd w:fill="1F3864" w:color="auto" w:val="clear"/>
+            <w:tcMar>
+              <w:top w:type="dxa" w:w="80"/>
+              <w:left w:type="dxa" w:w="100"/>
+              <w:bottom w:type="dxa" w:w="80"/>
+              <w:right w:type="dxa" w:w="100"/>
+            </w:tcMar>
+          </w:tcPr>
+          <w:p>
+            <w:r>
+              <w:rPr>
+                <w:b/>
+                <w:bCs/>
+                <w:i w:val="false"/>
+                <w:iCs w:val="false"/>
+                <w:color w:val="FFFFFF"/>
+              </w:rPr>
+              <w:t xml:space="preserve">Status</w:t>
+            </w:r>
+          </w:p>
+        </w:tc>
+      </w:tr>
+      <w:tr>
+        <w:tc>
+          <w:tcPr>
+            <w:tcW w:type="dxa" w:w="450"/>
+            <w:tcMar>
+              <w:top w:type="dxa" w:w="80"/>
+              <w:left w:type="dxa" w:w="100"/>
+              <w:bottom w:type="dxa" w:w="80"/>
+              <w:right w:type="dxa" w:w="100"/>
+            </w:tcMar>
+          </w:tcPr>
+          <w:p>
+            <w:r>
+              <w:t>{#risks}{num}</w:t>
+            </w:r>
+          </w:p>
+        </w:tc>
+        <w:tc>
+          <w:tcPr>
+            <w:tcW w:type="dxa" w:w="700"/>
+            <w:tcMar>
+              <w:top w:type="dxa" w:w="80"/>
+              <w:left w:type="dxa" w:w="100"/>
+              <w:bottom w:type="dxa" w:w="80"/>
+              <w:right w:type="dxa" w:w="100"/>
+            </w:tcMar>
+          </w:tcPr>
+          <w:p>
+            <w:r>
+              <w:t>{type}</w:t>
+            </w:r>
+          </w:p>
+        </w:tc>
+        <w:tc>
+          <w:tcPr>
+            <w:tcW w:type="dxa" w:w="2200"/>
+            <w:tcMar>
+              <w:top w:type="dxa" w:w="80"/>
+              <w:left w:type="dxa" w:w="100"/>
+              <w:bottom w:type="dxa" w:w="80"/>
+              <w:right w:type="dxa" w:w="100"/>
+            </w:tcMar>
+          </w:tcPr>
+          <w:p>
+            <w:r>
+              <w:t>{description}</w:t>
+            </w:r>
+          </w:p>
+        </w:tc>
+        <w:tc>
+          <w:tcPr>
+            <w:tcW w:type="dxa" w:w="850"/>
+            <w:tcMar>
+              <w:top w:type="dxa" w:w="80"/>
+              <w:left w:type="dxa" w:w="100"/>
+              <w:bottom w:type="dxa" w:w="80"/>
+              <w:right w:type="dxa" w:w="100"/>
+            </w:tcMar>
+          </w:tcPr>
+          <w:p>
+            <w:r>
+              <w:t>{probability}</w:t>
+            </w:r>
+          </w:p>
+        </w:tc>
+        <w:tc>
+          <w:tcPr>
+            <w:tcW w:type="dxa" w:w="750"/>
+            <w:tcMar>
+              <w:top w:type="dxa" w:w="80"/>
+              <w:left w:type="dxa" w:w="100"/>
+              <w:bottom w:type="dxa" w:w="80"/>
+              <w:right w:type="dxa" w:w="100"/>
+            </w:tcMar>
+          </w:tcPr>
+          <w:p>
+            <w:r>
+              <w:t>{impact}</w:t>
+            </w:r>
+          </w:p>
+        </w:tc>
+        <w:tc>
+          <w:tcPr>
+            <w:tcW w:type="dxa" w:w="650"/>
+            <w:tcMar>
+              <w:top w:type="dxa" w:w="80"/>
+              <w:left w:type="dxa" w:w="100"/>
+              <w:bottom w:type="dxa" w:w="80"/>
+              <w:right w:type="dxa" w:w="100"/>
+            </w:tcMar>
+          </w:tcPr>
+          <w:p>
+            <w:r>
+              <w:t>{score}</w:t>
+            </w:r>
+          </w:p>
+        </w:tc>
+        <w:tc>
+          <w:tcPr>
+            <w:tcW w:type="dxa" w:w="1800"/>
+            <w:tcMar>
+              <w:top w:type="dxa" w:w="80"/>
+              <w:left w:type="dxa" w:w="100"/>
+              <w:bottom w:type="dxa" w:w="80"/>
+              <w:right w:type="dxa" w:w="100"/>
+            </w:tcMar>
+          </w:tcPr>
+          <w:p>
+            <w:r>
+              <w:t>{response}</w:t>
+            </w:r>
+          </w:p>
+        </w:tc>
+        <w:tc>
+          <w:tcPr>
+            <w:tcW w:type="dxa" w:w="850"/>
+            <w:tcMar>
+              <w:top w:type="dxa" w:w="80"/>
+              <w:left w:type="dxa" w:w="100"/>
+              <w:bottom w:type="dxa" w:w="80"/>
+              <w:right w:type="dxa" w:w="100"/>
+            </w:tcMar>
+          </w:tcPr>
+          <w:p>
+            <w:r>
+              <w:t>{owner}</w:t>
+            </w:r>
+          </w:p>
+        </w:tc>
+        <w:tc>
+          <w:tcPr>
+            <w:tcW w:type="dxa" w:w="750"/>
+            <w:tcMar>
+              <w:top w:type="dxa" w:w="80"/>
+              <w:left w:type="dxa" w:w="100"/>
+              <w:bottom w:type="dxa" w:w="80"/>
+              <w:right w:type="dxa" w:w="100"/>
+            </w:tcMar>
+          </w:tcPr>
+          <w:p>
+            <w:r>
+              <w:t>{status}{/risks}</w:t>
+            </w:r>
+          </w:p>
+        </w:tc>
+      </w:tr>
+    </w:tbl>
+    <w:p>
+      <w:pPr>
+        <w:pStyle w:val="Heading1"/>
+        <w:pBdr>
+          <w:bottom w:val="single" w:color="1F3864" w:sz="6" w:space="4"/>
+        </w:pBdr>
+        <w:spacing w:after="160" w:before="320"/>
+      </w:pPr>
+      <w:r>
+        <w:rPr>
+          <w:b/>
+          <w:bCs/>
+          <w:color w:val="1F3864"/>
+          <w:sz w:val="28"/>
+          <w:szCs w:val="28"/>
+        </w:rPr>
+        <w:t xml:space="preserve">10. Dependency &amp; Decision Management</w:t>
+      </w:r>
+    </w:p>
+    <w:p>
+      <w:pPr>
+        <w:spacing w:after="120" w:before="160"/>
+      </w:pPr>
+      <w:r>
+        <w:rPr>
+          <w:i/>
+          <w:iCs/>
+          <w:color w:val="666666"/>
+        </w:rPr>
+        <w:t xml:space="preserve">Items this project is waiting on from the client, another internal team, or a third party. Sourced from the Dependencies tab.</w:t>
+      </w:r>
+    </w:p>
+    <w:tbl>
+      <w:tblPr>
+        <w:tblW w:type="dxa" w:w="9550"/>
+        <w:tblBorders>
+          <w:top w:val="single" w:color="auto" w:sz="4"/>
+          <w:left w:val="single" w:color="auto" w:sz="4"/>
+          <w:bottom w:val="single" w:color="auto" w:sz="4"/>
+          <w:right w:val="single" w:color="auto" w:sz="4"/>
+          <w:insideH w:val="single" w:color="auto" w:sz="4"/>
+          <w:insideV w:val="single" w:color="auto" w:sz="4"/>
+        </w:tblBorders>
+      </w:tblPr>
+      <w:tblGrid>
+        <w:gridCol w:w="450"/>
+        <w:gridCol w:w="1300"/>
+        <w:gridCol w:w="3200"/>
+        <w:gridCol w:w="1500"/>
+        <w:gridCol w:w="900"/>
+        <w:gridCol w:w="1300"/>
+        <w:gridCol w:w="900"/>
+      </w:tblGrid>
+      <w:tr>
+        <w:tc>
+          <w:tcPr>
+            <w:tcW w:type="dxa" w:w="450"/>
+            <w:shd w:fill="1F3864" w:color="auto" w:val="clear"/>
+            <w:tcMar>
+              <w:top w:type="dxa" w:w="80"/>
+              <w:left w:type="dxa" w:w="100"/>
+              <w:bottom w:type="dxa" w:w="80"/>
+              <w:right w:type="dxa" w:w="100"/>
+            </w:tcMar>
+          </w:tcPr>
+          <w:p>
+            <w:r>
+              <w:rPr>
+                <w:b/>
+                <w:bCs/>
+                <w:i w:val="false"/>
+                <w:iCs w:val="false"/>
+                <w:color w:val="FFFFFF"/>
+              </w:rPr>
+              <w:t xml:space="preserve">#</w:t>
+            </w:r>
+          </w:p>
+        </w:tc>
+        <w:tc>
+          <w:tcPr>
+            <w:tcW w:type="dxa" w:w="1300"/>
+            <w:shd w:fill="1F3864" w:color="auto" w:val="clear"/>
+            <w:tcMar>
+              <w:top w:type="dxa" w:w="80"/>
+              <w:left w:type="dxa" w:w="100"/>
+              <w:bottom w:type="dxa" w:w="80"/>
+              <w:right w:type="dxa" w:w="100"/>
+            </w:tcMar>
+          </w:tcPr>
+          <w:p>
+            <w:r>
+              <w:rPr>
+                <w:b/>
+                <w:bCs/>
+                <w:i w:val="false"/>
+                <w:iCs w:val="false"/>
+                <w:color w:val="FFFFFF"/>
+              </w:rPr>
+              <w:t xml:space="preserve">Category</w:t>
+            </w:r>
+          </w:p>
+        </w:tc>
+        <w:tc>
+          <w:tcPr>
+            <w:tcW w:type="dxa" w:w="3200"/>
+            <w:shd w:fill="1F3864" w:color="auto" w:val="clear"/>
+            <w:tcMar>
+              <w:top w:type="dxa" w:w="80"/>
+              <w:left w:type="dxa" w:w="100"/>
+              <w:bottom w:type="dxa" w:w="80"/>
+              <w:right w:type="dxa" w:w="100"/>
+            </w:tcMar>
+          </w:tcPr>
+          <w:p>
+            <w:r>
+              <w:rPr>
+                <w:b/>
+                <w:bCs/>
+                <w:i w:val="false"/>
+                <w:iCs w:val="false"/>
+                <w:color w:val="FFFFFF"/>
+              </w:rPr>
+              <w:t xml:space="preserve">Dependency / Decision</w:t>
+            </w:r>
+          </w:p>
+        </w:tc>
+        <w:tc>
+          <w:tcPr>
+            <w:tcW w:type="dxa" w:w="1500"/>
+            <w:shd w:fill="1F3864" w:color="auto" w:val="clear"/>
+            <w:tcMar>
+              <w:top w:type="dxa" w:w="80"/>
+              <w:left w:type="dxa" w:w="100"/>
+              <w:bottom w:type="dxa" w:w="80"/>
+              <w:right w:type="dxa" w:w="100"/>
+            </w:tcMar>
+          </w:tcPr>
+          <w:p>
+            <w:r>
+              <w:rPr>
+                <w:b/>
+                <w:bCs/>
+                <w:i w:val="false"/>
+                <w:iCs w:val="false"/>
+                <w:color w:val="FFFFFF"/>
+              </w:rPr>
+              <w:t xml:space="preserve">Responsible</w:t>
+            </w:r>
+          </w:p>
+        </w:tc>
+        <w:tc>
+          <w:tcPr>
+            <w:tcW w:type="dxa" w:w="900"/>
+            <w:shd w:fill="1F3864" w:color="auto" w:val="clear"/>
+            <w:tcMar>
+              <w:top w:type="dxa" w:w="80"/>
+              <w:left w:type="dxa" w:w="100"/>
+              <w:bottom w:type="dxa" w:w="80"/>
+              <w:right w:type="dxa" w:w="100"/>
+            </w:tcMar>
+          </w:tcPr>
+          <w:p>
+            <w:r>
+              <w:rPr>
+                <w:b/>
+                <w:bCs/>
+                <w:i w:val="false"/>
+                <w:iCs w:val="false"/>
+                <w:color w:val="FFFFFF"/>
+              </w:rPr>
+              <w:t xml:space="preserve">Priority</w:t>
+            </w:r>
+          </w:p>
+        </w:tc>
+        <w:tc>
+          <w:tcPr>
+            <w:tcW w:type="dxa" w:w="1300"/>
+            <w:shd w:fill="1F3864" w:color="auto" w:val="clear"/>
+            <w:tcMar>
+              <w:top w:type="dxa" w:w="80"/>
+              <w:left w:type="dxa" w:w="100"/>
+              <w:bottom w:type="dxa" w:w="80"/>
+              <w:right w:type="dxa" w:w="100"/>
+            </w:tcMar>
+          </w:tcPr>
+          <w:p>
+            <w:r>
+              <w:rPr>
+                <w:b/>
+                <w:bCs/>
+                <w:i w:val="false"/>
+                <w:iCs w:val="false"/>
+                <w:color w:val="FFFFFF"/>
+              </w:rPr>
+              <w:t xml:space="preserve">Expected Date</w:t>
+            </w:r>
+          </w:p>
+        </w:tc>
+        <w:tc>
+          <w:tcPr>
+            <w:tcW w:type="dxa" w:w="900"/>
+            <w:shd w:fill="1F3864" w:color="auto" w:val="clear"/>
+            <w:tcMar>
+              <w:top w:type="dxa" w:w="80"/>
+              <w:left w:type="dxa" w:w="100"/>
+              <w:bottom w:type="dxa" w:w="80"/>
+              <w:right w:type="dxa" w:w="100"/>
+            </w:tcMar>
+          </w:tcPr>
+          <w:p>
+            <w:r>
+              <w:rPr>
+                <w:b/>
+                <w:bCs/>
+                <w:i w:val="false"/>
+                <w:iCs w:val="false"/>
+                <w:color w:val="FFFFFF"/>
+              </w:rPr>
+              <w:t xml:space="preserve">Status</w:t>
+            </w:r>
+          </w:p>
+        </w:tc>
+      </w:tr>
+      <w:tr>
+        <w:tc>
+          <w:tcPr>
+            <w:tcW w:type="dxa" w:w="450"/>
+            <w:tcMar>
+              <w:top w:type="dxa" w:w="80"/>
+              <w:left w:type="dxa" w:w="100"/>
+              <w:bottom w:type="dxa" w:w="80"/>
+              <w:right w:type="dxa" w:w="100"/>
+            </w:tcMar>
+          </w:tcPr>
+          <w:p>
+            <w:r>
+              <w:t>{#dependencies}{num}</w:t>
+            </w:r>
+          </w:p>
+        </w:tc>
+        <w:tc>
+          <w:tcPr>
+            <w:tcW w:type="dxa" w:w="1300"/>
+            <w:tcMar>
+              <w:top w:type="dxa" w:w="80"/>
+              <w:left w:type="dxa" w:w="100"/>
+              <w:bottom w:type="dxa" w:w="80"/>
+              <w:right w:type="dxa" w:w="100"/>
+            </w:tcMar>
+          </w:tcPr>
+          <w:p>
+            <w:r>
+              <w:t>{category}</w:t>
+            </w:r>
+          </w:p>
+        </w:tc>
+        <w:tc>
+          <w:tcPr>
+            <w:tcW w:type="dxa" w:w="3200"/>
+            <w:tcMar>
+              <w:top w:type="dxa" w:w="80"/>
+              <w:left w:type="dxa" w:w="100"/>
+              <w:bottom w:type="dxa" w:w="80"/>
+              <w:right w:type="dxa" w:w="100"/>
+            </w:tcMar>
+          </w:tcPr>
+          <w:p>
+            <w:r>
+              <w:t>{description}</w:t>
+            </w:r>
+          </w:p>
+        </w:tc>
+        <w:tc>
+          <w:tcPr>
+            <w:tcW w:type="dxa" w:w="1500"/>
+            <w:tcMar>
+              <w:top w:type="dxa" w:w="80"/>
+              <w:left w:type="dxa" w:w="100"/>
+              <w:bottom w:type="dxa" w:w="80"/>
+              <w:right w:type="dxa" w:w="100"/>
+            </w:tcMar>
+          </w:tcPr>
+          <w:p>
+            <w:r>
+              <w:t>{responsible}</w:t>
+            </w:r>
+          </w:p>
+        </w:tc>
+        <w:tc>
+          <w:tcPr>
+            <w:tcW w:type="dxa" w:w="900"/>
+            <w:tcMar>
+              <w:top w:type="dxa" w:w="80"/>
+              <w:left w:type="dxa" w:w="100"/>
+              <w:bottom w:type="dxa" w:w="80"/>
+              <w:right w:type="dxa" w:w="100"/>
+            </w:tcMar>
+          </w:tcPr>
+          <w:p>
+            <w:r>
+              <w:t>{priority}</w:t>
+            </w:r>
+          </w:p>
+        </w:tc>
+        <w:tc>
+          <w:tcPr>
+            <w:tcW w:type="dxa" w:w="1300"/>
+            <w:tcMar>
+              <w:top w:type="dxa" w:w="80"/>
+              <w:left w:type="dxa" w:w="100"/>
+              <w:bottom w:type="dxa" w:w="80"/>
+              <w:right w:type="dxa" w:w="100"/>
+            </w:tcMar>
+          </w:tcPr>
+          <w:p>
+            <w:r>
+              <w:t>{expectedDate}</w:t>
+            </w:r>
+          </w:p>
+        </w:tc>
+        <w:tc>
+          <w:tcPr>
+            <w:tcW w:type="dxa" w:w="900"/>
+            <w:tcMar>
+              <w:top w:type="dxa" w:w="80"/>
+              <w:left w:type="dxa" w:w="100"/>
+              <w:bottom w:type="dxa" w:w="80"/>
+              <w:right w:type="dxa" w:w="100"/>
+            </w:tcMar>
+          </w:tcPr>
+          <w:p>
+            <w:r>
+              <w:t>{status}{/dependencies}</w:t>
+            </w:r>
+          </w:p>
+        </w:tc>
+      </w:tr>
+    </w:tbl>
+    <w:p>
+      <w:pPr>
+        <w:pStyle w:val="Heading1"/>
+        <w:pBdr>
+          <w:bottom w:val="single" w:color="1F3864" w:sz="6" w:space="4"/>
+        </w:pBdr>
+        <w:spacing w:after="160" w:before="320"/>
+      </w:pPr>
+      <w:r>
+        <w:rPr>
+          <w:b/>
+          <w:bCs/>
+          <w:color w:val="1F3864"/>
+          <w:sz w:val="28"/>
+          <w:szCs w:val="28"/>
+        </w:rPr>
+        <w:t xml:space="preserve">11. Scope &amp; Deliverables Baseline</w:t>
+      </w:r>
+    </w:p>
+    <w:p>
+      <w:pPr>
+        <w:spacing w:after="120" w:before="160"/>
+      </w:pPr>
+      <w:r>
+        <w:rPr>
+          <w:i/>
+          <w:iCs/>
+          <w:color w:val="666666"/>
+        </w:rPr>
+        <w:t xml:space="preserve">Sourced from the Delivery tab's milestones, framed as the contractual acceptance baseline.</w:t>
+      </w:r>
+    </w:p>
+    <w:tbl>
+      <w:tblPr>
+        <w:tblW w:type="dxa" w:w="9000"/>
+        <w:tblBorders>
+          <w:top w:val="single" w:color="auto" w:sz="4"/>
+          <w:left w:val="single" w:color="auto" w:sz="4"/>
+          <w:bottom w:val="single" w:color="auto" w:sz="4"/>
+          <w:right w:val="single" w:color="auto" w:sz="4"/>
+          <w:insideH w:val="single" w:color="auto" w:sz="4"/>
+          <w:insideV w:val="single" w:color="auto" w:sz="4"/>
+        </w:tblBorders>
+      </w:tblPr>
+      <w:tblGrid>
+        <w:gridCol w:w="2200"/>
+        <w:gridCol w:w="1100"/>
+        <w:gridCol w:w="3200"/>
+        <w:gridCol w:w="1300"/>
+        <w:gridCol w:w="1200"/>
+      </w:tblGrid>
+      <w:tr>
+        <w:tc>
+          <w:tcPr>
+            <w:tcW w:type="dxa" w:w="2200"/>
+            <w:shd w:fill="1F3864" w:color="auto" w:val="clear"/>
+            <w:tcMar>
+              <w:top w:type="dxa" w:w="80"/>
+              <w:left w:type="dxa" w:w="100"/>
+              <w:bottom w:type="dxa" w:w="80"/>
+              <w:right w:type="dxa" w:w="100"/>
+            </w:tcMar>
+          </w:tcPr>
+          <w:p>
+            <w:r>
+              <w:rPr>
+                <w:b/>
+                <w:bCs/>
+                <w:i w:val="false"/>
+                <w:iCs w:val="false"/>
+                <w:color w:val="FFFFFF"/>
+              </w:rPr>
+              <w:t xml:space="preserve">Deliverable</w:t>
+            </w:r>
+          </w:p>
+        </w:tc>
+        <w:tc>
+          <w:tcPr>
+            <w:tcW w:type="dxa" w:w="1100"/>
+            <w:shd w:fill="1F3864" w:color="auto" w:val="clear"/>
+            <w:tcMar>
+              <w:top w:type="dxa" w:w="80"/>
+              <w:left w:type="dxa" w:w="100"/>
+              <w:bottom w:type="dxa" w:w="80"/>
+              <w:right w:type="dxa" w:w="100"/>
+            </w:tcMar>
+          </w:tcPr>
+          <w:p>
+            <w:r>
+              <w:rPr>
+                <w:b/>
+                <w:bCs/>
+                <w:i w:val="false"/>
+                <w:iCs w:val="false"/>
+                <w:color w:val="FFFFFF"/>
+              </w:rPr>
+              <w:t xml:space="preserve">Type</w:t>
+            </w:r>
+          </w:p>
+        </w:tc>
+        <w:tc>
+          <w:tcPr>
+            <w:tcW w:type="dxa" w:w="3200"/>
+            <w:shd w:fill="1F3864" w:color="auto" w:val="clear"/>
+            <w:tcMar>
+              <w:top w:type="dxa" w:w="80"/>
+              <w:left w:type="dxa" w:w="100"/>
+              <w:bottom w:type="dxa" w:w="80"/>
+              <w:right w:type="dxa" w:w="100"/>
+            </w:tcMar>
+          </w:tcPr>
+          <w:p>
+            <w:r>
+              <w:rPr>
+                <w:b/>
+                <w:bCs/>
+                <w:i w:val="false"/>
+                <w:iCs w:val="false"/>
+                <w:color w:val="FFFFFF"/>
+              </w:rPr>
+              <w:t xml:space="preserve">Acceptance Evidence</w:t>
+            </w:r>
+          </w:p>
+        </w:tc>
+        <w:tc>
+          <w:tcPr>
+            <w:tcW w:type="dxa" w:w="1300"/>
+            <w:shd w:fill="1F3864" w:color="auto" w:val="clear"/>
+            <w:tcMar>
+              <w:top w:type="dxa" w:w="80"/>
+              <w:left w:type="dxa" w:w="100"/>
+              <w:bottom w:type="dxa" w:w="80"/>
+              <w:right w:type="dxa" w:w="100"/>
+            </w:tcMar>
+          </w:tcPr>
+          <w:p>
+            <w:r>
+              <w:rPr>
+                <w:b/>
+                <w:bCs/>
+                <w:i w:val="false"/>
+                <w:iCs w:val="false"/>
+                <w:color w:val="FFFFFF"/>
+              </w:rPr>
+              <w:t xml:space="preserve">Owner</w:t>
+            </w:r>
+          </w:p>
+        </w:tc>
+        <w:tc>
+          <w:tcPr>
+            <w:tcW w:type="dxa" w:w="1200"/>
+            <w:shd w:fill="1F3864" w:color="auto" w:val="clear"/>
+            <w:tcMar>
+              <w:top w:type="dxa" w:w="80"/>
+              <w:left w:type="dxa" w:w="100"/>
+              <w:bottom w:type="dxa" w:w="80"/>
+              <w:right w:type="dxa" w:w="100"/>
+            </w:tcMar>
+          </w:tcPr>
+          <w:p>
+            <w:r>
+              <w:rPr>
+                <w:b/>
+                <w:bCs/>
+                <w:i w:val="false"/>
+                <w:iCs w:val="false"/>
+                <w:color w:val="FFFFFF"/>
+              </w:rPr>
+              <w:t xml:space="preserve">Target</w:t>
+            </w:r>
+          </w:p>
+        </w:tc>
+      </w:tr>
+      <w:tr>
+        <w:tc>
+          <w:tcPr>
+            <w:tcW w:type="dxa" w:w="2200"/>
+            <w:tcMar>
+              <w:top w:type="dxa" w:w="80"/>
+              <w:left w:type="dxa" w:w="100"/>
+              <w:bottom w:type="dxa" w:w="80"/>
+              <w:right w:type="dxa" w:w="100"/>
+            </w:tcMar>
+          </w:tcPr>
+          <w:p>
+            <w:r>
+              <w:t>{#deliverables}{name}</w:t>
+            </w:r>
+          </w:p>
+        </w:tc>
+        <w:tc>
+          <w:tcPr>
+            <w:tcW w:type="dxa" w:w="1100"/>
+            <w:tcMar>
+              <w:top w:type="dxa" w:w="80"/>
+              <w:left w:type="dxa" w:w="100"/>
+              <w:bottom w:type="dxa" w:w="80"/>
+              <w:right w:type="dxa" w:w="100"/>
+            </w:tcMar>
+          </w:tcPr>
+          <w:p>
+            <w:r>
+              <w:t>{type}</w:t>
+            </w:r>
+          </w:p>
+        </w:tc>
+        <w:tc>
+          <w:tcPr>
+            <w:tcW w:type="dxa" w:w="3200"/>
+            <w:tcMar>
+              <w:top w:type="dxa" w:w="80"/>
+              <w:left w:type="dxa" w:w="100"/>
+              <w:bottom w:type="dxa" w:w="80"/>
+              <w:right w:type="dxa" w:w="100"/>
+            </w:tcMar>
+          </w:tcPr>
+          <w:p>
+            <w:r>
+              <w:t>{acceptanceCriteria}</w:t>
+            </w:r>
+          </w:p>
+        </w:tc>
+        <w:tc>
+          <w:tcPr>
+            <w:tcW w:type="dxa" w:w="1300"/>
+            <w:tcMar>
+              <w:top w:type="dxa" w:w="80"/>
+              <w:left w:type="dxa" w:w="100"/>
+              <w:bottom w:type="dxa" w:w="80"/>
+              <w:right w:type="dxa" w:w="100"/>
+            </w:tcMar>
+          </w:tcPr>
+          <w:p>
+            <w:r>
+              <w:t>{owner}</w:t>
+            </w:r>
+          </w:p>
+        </w:tc>
+        <w:tc>
+          <w:tcPr>
+            <w:tcW w:type="dxa" w:w="1200"/>
+            <w:tcMar>
+              <w:top w:type="dxa" w:w="80"/>
+              <w:left w:type="dxa" w:w="100"/>
+              <w:bottom w:type="dxa" w:w="80"/>
+              <w:right w:type="dxa" w:w="100"/>
+            </w:tcMar>
+          </w:tcPr>
+          <w:p>
+            <w:r>
+              <w:t>{target}{/deliverables}</w:t>
+            </w:r>
+          </w:p>
+        </w:tc>
+      </w:tr>
+    </w:tbl>
+    <w:p>
+      <w:pPr>
+        <w:pStyle w:val="Heading1"/>
+        <w:pBdr>
+          <w:bottom w:val="single" w:color="1F3864" w:sz="6" w:space="4"/>
+        </w:pBdr>
+        <w:spacing w:after="160" w:before="320"/>
+      </w:pPr>
+      <w:r>
+        <w:rPr>
+          <w:b/>
+          <w:bCs/>
+          <w:color w:val="1F3864"/>
+          <w:sz w:val="28"/>
+          <w:szCs w:val="28"/>
+        </w:rPr>
+        <w:t xml:space="preserve">12. Schedule &amp; Milestones</w:t>
+      </w:r>
+    </w:p>
+    <w:p>
+      <w:pPr>
+        <w:spacing w:after="120" w:before="160"/>
+      </w:pPr>
+      <w:r>
+        <w:rPr>
+          <w:i/>
+          <w:iCs/>
+          <w:color w:val="666666"/>
+        </w:rPr>
+        <w:t xml:space="preserve">Sourced from the Delivery tab's milestones, framed for execution tracking.</w:t>
+      </w:r>
+    </w:p>
+    <w:tbl>
+      <w:tblPr>
+        <w:tblW w:type="dxa" w:w="9000"/>
+        <w:tblBorders>
+          <w:top w:val="single" w:color="auto" w:sz="4"/>
+          <w:left w:val="single" w:color="auto" w:sz="4"/>
+          <w:bottom w:val="single" w:color="auto" w:sz="4"/>
+          <w:right w:val="single" w:color="auto" w:sz="4"/>
+          <w:insideH w:val="single" w:color="auto" w:sz="4"/>
+          <w:insideV w:val="single" w:color="auto" w:sz="4"/>
+        </w:tblBorders>
+      </w:tblPr>
+      <w:tblGrid>
+        <w:gridCol w:w="2400"/>
+        <w:gridCol w:w="1300"/>
+        <w:gridCol w:w="1300"/>
+        <w:gridCol w:w="3000"/>
+        <w:gridCol w:w="1000"/>
+      </w:tblGrid>
+      <w:tr>
+        <w:tc>
+          <w:tcPr>
+            <w:tcW w:type="dxa" w:w="2400"/>
+            <w:shd w:fill="1F3864" w:color="auto" w:val="clear"/>
+            <w:tcMar>
+              <w:top w:type="dxa" w:w="80"/>
+              <w:left w:type="dxa" w:w="100"/>
+              <w:bottom w:type="dxa" w:w="80"/>
+              <w:right w:type="dxa" w:w="100"/>
+            </w:tcMar>
+          </w:tcPr>
+          <w:p>
+            <w:r>
+              <w:rPr>
+                <w:b/>
+                <w:bCs/>
+                <w:i w:val="false"/>
+                <w:iCs w:val="false"/>
+                <w:color w:val="FFFFFF"/>
+              </w:rPr>
+              <w:t xml:space="preserve">Milestone</w:t>
+            </w:r>
+          </w:p>
+        </w:tc>
+        <w:tc>
+          <w:tcPr>
+            <w:tcW w:type="dxa" w:w="1300"/>
+            <w:shd w:fill="1F3864" w:color="auto" w:val="clear"/>
+            <w:tcMar>
+              <w:top w:type="dxa" w:w="80"/>
+              <w:left w:type="dxa" w:w="100"/>
+              <w:bottom w:type="dxa" w:w="80"/>
+              <w:right w:type="dxa" w:w="100"/>
+            </w:tcMar>
+          </w:tcPr>
+          <w:p>
+            <w:r>
+              <w:rPr>
+                <w:b/>
+                <w:bCs/>
+                <w:i w:val="false"/>
+                <w:iCs w:val="false"/>
+                <w:color w:val="FFFFFF"/>
+              </w:rPr>
+              <w:t xml:space="preserve">Baseline Date</w:t>
+            </w:r>
+          </w:p>
+        </w:tc>
+        <w:tc>
+          <w:tcPr>
+            <w:tcW w:type="dxa" w:w="1300"/>
+            <w:shd w:fill="1F3864" w:color="auto" w:val="clear"/>
+            <w:tcMar>
+              <w:top w:type="dxa" w:w="80"/>
+              <w:left w:type="dxa" w:w="100"/>
+              <w:bottom w:type="dxa" w:w="80"/>
+              <w:right w:type="dxa" w:w="100"/>
+            </w:tcMar>
+          </w:tcPr>
+          <w:p>
+            <w:r>
+              <w:rPr>
+                <w:b/>
+                <w:bCs/>
+                <w:i w:val="false"/>
+                <w:iCs w:val="false"/>
+                <w:color w:val="FFFFFF"/>
+              </w:rPr>
+              <w:t xml:space="preserve">Owner</w:t>
+            </w:r>
+          </w:p>
+        </w:tc>
+        <w:tc>
+          <w:tcPr>
+            <w:tcW w:type="dxa" w:w="3000"/>
+            <w:shd w:fill="1F3864" w:color="auto" w:val="clear"/>
+            <w:tcMar>
+              <w:top w:type="dxa" w:w="80"/>
+              <w:left w:type="dxa" w:w="100"/>
+              <w:bottom w:type="dxa" w:w="80"/>
+              <w:right w:type="dxa" w:w="100"/>
+            </w:tcMar>
+          </w:tcPr>
+          <w:p>
+            <w:r>
+              <w:rPr>
+                <w:b/>
+                <w:bCs/>
+                <w:i w:val="false"/>
+                <w:iCs w:val="false"/>
+                <w:color w:val="FFFFFF"/>
+              </w:rPr>
+              <w:t xml:space="preserve">Exit Criteria</w:t>
+            </w:r>
+          </w:p>
+        </w:tc>
+        <w:tc>
+          <w:tcPr>
+            <w:tcW w:type="dxa" w:w="1000"/>
+            <w:shd w:fill="1F3864" w:color="auto" w:val="clear"/>
+            <w:tcMar>
+              <w:top w:type="dxa" w:w="80"/>
+              <w:left w:type="dxa" w:w="100"/>
+              <w:bottom w:type="dxa" w:w="80"/>
+              <w:right w:type="dxa" w:w="100"/>
+            </w:tcMar>
+          </w:tcPr>
+          <w:p>
+            <w:r>
+              <w:rPr>
+                <w:b/>
+                <w:bCs/>
+                <w:i w:val="false"/>
+                <w:iCs w:val="false"/>
+                <w:color w:val="FFFFFF"/>
+              </w:rPr>
+              <w:t xml:space="preserve">Status</w:t>
+            </w:r>
+          </w:p>
+        </w:tc>
+      </w:tr>
+      <w:tr>
+        <w:tc>
+          <w:tcPr>
+            <w:tcW w:type="dxa" w:w="2400"/>
+            <w:tcMar>
+              <w:top w:type="dxa" w:w="80"/>
+              <w:left w:type="dxa" w:w="100"/>
+              <w:bottom w:type="dxa" w:w="80"/>
+              <w:right w:type="dxa" w:w="100"/>
+            </w:tcMar>
+          </w:tcPr>
+          <w:p>
+            <w:r>
+              <w:t>{#milestones}{name}</w:t>
+            </w:r>
+          </w:p>
+        </w:tc>
+        <w:tc>
+          <w:tcPr>
+            <w:tcW w:type="dxa" w:w="1300"/>
+            <w:tcMar>
+              <w:top w:type="dxa" w:w="80"/>
+              <w:left w:type="dxa" w:w="100"/>
+              <w:bottom w:type="dxa" w:w="80"/>
+              <w:right w:type="dxa" w:w="100"/>
+            </w:tcMar>
+          </w:tcPr>
+          <w:p>
+            <w:r>
+              <w:t>{target}</w:t>
+            </w:r>
+          </w:p>
+        </w:tc>
+        <w:tc>
+          <w:tcPr>
+            <w:tcW w:type="dxa" w:w="1300"/>
+            <w:tcMar>
+              <w:top w:type="dxa" w:w="80"/>
+              <w:left w:type="dxa" w:w="100"/>
+              <w:bottom w:type="dxa" w:w="80"/>
+              <w:right w:type="dxa" w:w="100"/>
+            </w:tcMar>
+          </w:tcPr>
+          <w:p>
+            <w:r>
+              <w:t>{owner}</w:t>
+            </w:r>
+          </w:p>
+        </w:tc>
+        <w:tc>
+          <w:tcPr>
+            <w:tcW w:type="dxa" w:w="3000"/>
+            <w:tcMar>
+              <w:top w:type="dxa" w:w="80"/>
+              <w:left w:type="dxa" w:w="100"/>
+              <w:bottom w:type="dxa" w:w="80"/>
+              <w:right w:type="dxa" w:w="100"/>
+            </w:tcMar>
+          </w:tcPr>
+          <w:p>
+            <w:r>
+              <w:t>{exitCriteria}</w:t>
+            </w:r>
+          </w:p>
+        </w:tc>
+        <w:tc>
+          <w:tcPr>
+            <w:tcW w:type="dxa" w:w="1000"/>
+            <w:tcMar>
+              <w:top w:type="dxa" w:w="80"/>
+              <w:left w:type="dxa" w:w="100"/>
+              <w:bottom w:type="dxa" w:w="80"/>
+              <w:right w:type="dxa" w:w="100"/>
+            </w:tcMar>
+          </w:tcPr>
+          <w:p>
+            <w:r>
+              <w:t>{status}{/milestones}</w:t>
+            </w:r>
+          </w:p>
+        </w:tc>
+      </w:tr>
+    </w:tbl>
+    <w:p>
+      <w:pPr>
+        <w:pStyle w:val="Heading1"/>
+        <w:pBdr>
+          <w:bottom w:val="single" w:color="1F3864" w:sz="6" w:space="4"/>
+        </w:pBdr>
+        <w:spacing w:after="160" w:before="320"/>
+      </w:pPr>
+      <w:r>
+        <w:rPr>
+          <w:b/>
+          <w:bCs/>
+          <w:color w:val="1F3864"/>
+          <w:sz w:val="28"/>
+          <w:szCs w:val="28"/>
+        </w:rPr>
+        <w:t xml:space="preserve">13. Resource &amp; Responsibility Plan</w:t>
+      </w:r>
+    </w:p>
+    <w:p>
+      <w:pPr>
+        <w:spacing w:after="120" w:before="160"/>
+      </w:pPr>
+      <w:r>
+        <w:rPr>
+          <w:i/>
+          <w:iCs/>
+          <w:color w:val="666666"/>
+        </w:rPr>
+        <w:t xml:space="preserve">Static role-level staffing baseline.</w:t>
+      </w:r>
+    </w:p>
+    <w:tbl>
+      <w:tblPr>
+        <w:tblW w:type="dxa" w:w="9000"/>
+        <w:tblBorders>
+          <w:top w:val="single" w:color="auto" w:sz="4"/>
+          <w:left w:val="single" w:color="auto" w:sz="4"/>
+          <w:bottom w:val="single" w:color="auto" w:sz="4"/>
+          <w:right w:val="single" w:color="auto" w:sz="4"/>
+          <w:insideH w:val="single" w:color="auto" w:sz="4"/>
+          <w:insideV w:val="single" w:color="auto" w:sz="4"/>
+        </w:tblBorders>
+      </w:tblPr>
+      <w:tblGrid>
+        <w:gridCol w:w="1800"/>
+        <w:gridCol w:w="1200"/>
+        <w:gridCol w:w="3800"/>
+        <w:gridCol w:w="2200"/>
+      </w:tblGrid>
+      <w:tr>
+        <w:tc>
+          <w:tcPr>
+            <w:tcW w:type="dxa" w:w="1800"/>
+            <w:shd w:fill="1F3864" w:color="auto" w:val="clear"/>
+            <w:tcMar>
+              <w:top w:type="dxa" w:w="80"/>
+              <w:left w:type="dxa" w:w="100"/>
+              <w:bottom w:type="dxa" w:w="80"/>
+              <w:right w:type="dxa" w:w="100"/>
+            </w:tcMar>
+          </w:tcPr>
+          <w:p>
+            <w:r>
+              <w:rPr>
+                <w:b/>
+                <w:bCs/>
+                <w:i w:val="false"/>
+                <w:iCs w:val="false"/>
+                <w:color w:val="FFFFFF"/>
+              </w:rPr>
+              <w:t xml:space="preserve">Role</w:t>
+            </w:r>
+          </w:p>
+        </w:tc>
+        <w:tc>
+          <w:tcPr>
+            <w:tcW w:type="dxa" w:w="1200"/>
+            <w:shd w:fill="1F3864" w:color="auto" w:val="clear"/>
+            <w:tcMar>
+              <w:top w:type="dxa" w:w="80"/>
+              <w:left w:type="dxa" w:w="100"/>
+              <w:bottom w:type="dxa" w:w="80"/>
+              <w:right w:type="dxa" w:w="100"/>
+            </w:tcMar>
+          </w:tcPr>
+          <w:p>
+            <w:r>
+              <w:rPr>
+                <w:b/>
+                <w:bCs/>
+                <w:i w:val="false"/>
+                <w:iCs w:val="false"/>
+                <w:color w:val="FFFFFF"/>
+              </w:rPr>
+              <w:t xml:space="preserve">Allocation</w:t>
+            </w:r>
+          </w:p>
+        </w:tc>
+        <w:tc>
+          <w:tcPr>
+            <w:tcW w:type="dxa" w:w="3800"/>
+            <w:shd w:fill="1F3864" w:color="auto" w:val="clear"/>
+            <w:tcMar>
+              <w:top w:type="dxa" w:w="80"/>
+              <w:left w:type="dxa" w:w="100"/>
+              <w:bottom w:type="dxa" w:w="80"/>
+              <w:right w:type="dxa" w:w="100"/>
+            </w:tcMar>
+          </w:tcPr>
+          <w:p>
+            <w:r>
+              <w:rPr>
+                <w:b/>
+                <w:bCs/>
+                <w:i w:val="false"/>
+                <w:iCs w:val="false"/>
+                <w:color w:val="FFFFFF"/>
+              </w:rPr>
+              <w:t xml:space="preserve">Primary Responsibility</w:t>
+            </w:r>
+          </w:p>
+        </w:tc>
+        <w:tc>
+          <w:tcPr>
+            <w:tcW w:type="dxa" w:w="2200"/>
+            <w:shd w:fill="1F3864" w:color="auto" w:val="clear"/>
+            <w:tcMar>
+              <w:top w:type="dxa" w:w="80"/>
+              <w:left w:type="dxa" w:w="100"/>
+              <w:bottom w:type="dxa" w:w="80"/>
+              <w:right w:type="dxa" w:w="100"/>
+            </w:tcMar>
+          </w:tcPr>
+          <w:p>
+            <w:r>
+              <w:rPr>
+                <w:b/>
+                <w:bCs/>
+                <w:i w:val="false"/>
+                <w:iCs w:val="false"/>
+                <w:color w:val="FFFFFF"/>
+              </w:rPr>
+              <w:t xml:space="preserve">Backup / Escalation</w:t>
+            </w:r>
+          </w:p>
+        </w:tc>
+      </w:tr>
+      <w:tr>
+        <w:tc>
+          <w:tcPr>
+            <w:tcW w:type="dxa" w:w="1800"/>
+            <w:tcMar>
+              <w:top w:type="dxa" w:w="80"/>
+              <w:left w:type="dxa" w:w="100"/>
+              <w:bottom w:type="dxa" w:w="80"/>
+              <w:right w:type="dxa" w:w="100"/>
+            </w:tcMar>
+          </w:tcPr>
+          <w:p>
+            <w:r>
+              <w:t>{#resources}{role}</w:t>
+            </w:r>
+          </w:p>
+        </w:tc>
+        <w:tc>
+          <w:tcPr>
+            <w:tcW w:type="dxa" w:w="1200"/>
+            <w:tcMar>
+              <w:top w:type="dxa" w:w="80"/>
+              <w:left w:type="dxa" w:w="100"/>
+              <w:bottom w:type="dxa" w:w="80"/>
+              <w:right w:type="dxa" w:w="100"/>
+            </w:tcMar>
+          </w:tcPr>
+          <w:p>
+            <w:r>
+              <w:t>{allocation}</w:t>
+            </w:r>
+          </w:p>
+        </w:tc>
+        <w:tc>
+          <w:tcPr>
+            <w:tcW w:type="dxa" w:w="3800"/>
+            <w:tcMar>
+              <w:top w:type="dxa" w:w="80"/>
+              <w:left w:type="dxa" w:w="100"/>
+              <w:bottom w:type="dxa" w:w="80"/>
+              <w:right w:type="dxa" w:w="100"/>
+            </w:tcMar>
+          </w:tcPr>
+          <w:p>
+            <w:r>
+              <w:t>{responsibility}</w:t>
+            </w:r>
+          </w:p>
+        </w:tc>
+        <w:tc>
+          <w:tcPr>
+            <w:tcW w:type="dxa" w:w="2200"/>
+            <w:tcMar>
+              <w:top w:type="dxa" w:w="80"/>
+              <w:left w:type="dxa" w:w="100"/>
+              <w:bottom w:type="dxa" w:w="80"/>
+              <w:right w:type="dxa" w:w="100"/>
+            </w:tcMar>
+          </w:tcPr>
+          <w:p>
+            <w:r>
+              <w:t>{backup}{/resources}</w:t>
+            </w:r>
+          </w:p>
+        </w:tc>
+      </w:tr>
+    </w:tbl>
+    <w:p>
+      <w:pPr>
+        <w:pStyle w:val="Heading1"/>
+        <w:pBdr>
+          <w:bottom w:val="single" w:color="1F3864" w:sz="6" w:space="4"/>
+        </w:pBdr>
+        <w:spacing w:after="160" w:before="320"/>
+      </w:pPr>
+      <w:r>
+        <w:rPr>
+          <w:b/>
+          <w:bCs/>
+          <w:color w:val="1F3864"/>
+          <w:sz w:val="28"/>
+          <w:szCs w:val="28"/>
+        </w:rPr>
+        <w:t xml:space="preserve">14. PMO Health &amp; Control Gates</w:t>
+      </w:r>
+    </w:p>
+    <w:p>
+      <w:pPr>
+        <w:spacing w:after="120" w:before="160"/>
+      </w:pPr>
+      <w:r>
+        <w:rPr>
+          <w:i/>
+          <w:iCs/>
+          <w:color w:val="666666"/>
+        </w:rPr>
+        <w:t xml:space="preserve">Formal stage-gate sign-off checklist (G0-G6).</w:t>
+      </w:r>
+    </w:p>
+    <w:tbl>
+      <w:tblPr>
+        <w:tblW w:type="dxa" w:w="9000"/>
+        <w:tblBorders>
+          <w:top w:val="single" w:color="auto" w:sz="4"/>
+          <w:left w:val="single" w:color="auto" w:sz="4"/>
+          <w:bottom w:val="single" w:color="auto" w:sz="4"/>
+          <w:right w:val="single" w:color="auto" w:sz="4"/>
+          <w:insideH w:val="single" w:color="auto" w:sz="4"/>
+          <w:insideV w:val="single" w:color="auto" w:sz="4"/>
+        </w:tblBorders>
+      </w:tblPr>
+      <w:tblGrid>
+        <w:gridCol w:w="1600"/>
+        <w:gridCol w:w="3400"/>
+        <w:gridCol w:w="2500"/>
+        <w:gridCol w:w="1500"/>
+      </w:tblGrid>
+      <w:tr>
+        <w:tc>
+          <w:tcPr>
+            <w:tcW w:type="dxa" w:w="1600"/>
+            <w:shd w:fill="1F3864" w:color="auto" w:val="clear"/>
+            <w:tcMar>
+              <w:top w:type="dxa" w:w="80"/>
+              <w:left w:type="dxa" w:w="100"/>
+              <w:bottom w:type="dxa" w:w="80"/>
+              <w:right w:type="dxa" w:w="100"/>
+            </w:tcMar>
+          </w:tcPr>
+          <w:p>
+            <w:r>
+              <w:rPr>
+                <w:b/>
+                <w:bCs/>
+                <w:i w:val="false"/>
+                <w:iCs w:val="false"/>
+                <w:color w:val="FFFFFF"/>
+              </w:rPr>
+              <w:t xml:space="preserve">Gate</w:t>
+            </w:r>
+          </w:p>
+        </w:tc>
+        <w:tc>
+          <w:tcPr>
+            <w:tcW w:type="dxa" w:w="3400"/>
+            <w:shd w:fill="1F3864" w:color="auto" w:val="clear"/>
+            <w:tcMar>
+              <w:top w:type="dxa" w:w="80"/>
+              <w:left w:type="dxa" w:w="100"/>
+              <w:bottom w:type="dxa" w:w="80"/>
+              <w:right w:type="dxa" w:w="100"/>
+            </w:tcMar>
+          </w:tcPr>
+          <w:p>
+            <w:r>
+              <w:rPr>
+                <w:b/>
+                <w:bCs/>
+                <w:i w:val="false"/>
+                <w:iCs w:val="false"/>
+                <w:color w:val="FFFFFF"/>
+              </w:rPr>
+              <w:t xml:space="preserve">Required Evidence</w:t>
+            </w:r>
+          </w:p>
+        </w:tc>
+        <w:tc>
+          <w:tcPr>
+            <w:tcW w:type="dxa" w:w="2500"/>
+            <w:shd w:fill="1F3864" w:color="auto" w:val="clear"/>
+            <w:tcMar>
+              <w:top w:type="dxa" w:w="80"/>
+              <w:left w:type="dxa" w:w="100"/>
+              <w:bottom w:type="dxa" w:w="80"/>
+              <w:right w:type="dxa" w:w="100"/>
+            </w:tcMar>
+          </w:tcPr>
+          <w:p>
+            <w:r>
+              <w:rPr>
+                <w:b/>
+                <w:bCs/>
+                <w:i w:val="false"/>
+                <w:iCs w:val="false"/>
+                <w:color w:val="FFFFFF"/>
+              </w:rPr>
+              <w:t xml:space="preserve">Exit Condition</w:t>
+            </w:r>
+          </w:p>
+        </w:tc>
+        <w:tc>
+          <w:tcPr>
+            <w:tcW w:type="dxa" w:w="1500"/>
+            <w:shd w:fill="1F3864" w:color="auto" w:val="clear"/>
+            <w:tcMar>
+              <w:top w:type="dxa" w:w="80"/>
+              <w:left w:type="dxa" w:w="100"/>
+              <w:bottom w:type="dxa" w:w="80"/>
+              <w:right w:type="dxa" w:w="100"/>
+            </w:tcMar>
+          </w:tcPr>
+          <w:p>
+            <w:r>
+              <w:rPr>
+                <w:b/>
+                <w:bCs/>
+                <w:i w:val="false"/>
+                <w:iCs w:val="false"/>
+                <w:color w:val="FFFFFF"/>
+              </w:rPr>
+              <w:t xml:space="preserve">Status</w:t>
+            </w:r>
+          </w:p>
+        </w:tc>
+      </w:tr>
+      <w:tr>
+        <w:tc>
+          <w:tcPr>
+            <w:tcW w:type="dxa" w:w="1600"/>
+            <w:tcMar>
+              <w:top w:type="dxa" w:w="80"/>
+              <w:left w:type="dxa" w:w="100"/>
+              <w:bottom w:type="dxa" w:w="80"/>
+              <w:right w:type="dxa" w:w="100"/>
+            </w:tcMar>
+          </w:tcPr>
+          <w:p>
+            <w:r>
+              <w:t>{#gates}{gate}</w:t>
+            </w:r>
+          </w:p>
+        </w:tc>
+        <w:tc>
+          <w:tcPr>
+            <w:tcW w:type="dxa" w:w="3400"/>
+            <w:tcMar>
+              <w:top w:type="dxa" w:w="80"/>
+              <w:left w:type="dxa" w:w="100"/>
+              <w:bottom w:type="dxa" w:w="80"/>
+              <w:right w:type="dxa" w:w="100"/>
+            </w:tcMar>
+          </w:tcPr>
+          <w:p>
+            <w:r>
+              <w:t>{requiredEvidence}</w:t>
+            </w:r>
+          </w:p>
+        </w:tc>
+        <w:tc>
+          <w:tcPr>
+            <w:tcW w:type="dxa" w:w="2500"/>
+            <w:tcMar>
+              <w:top w:type="dxa" w:w="80"/>
+              <w:left w:type="dxa" w:w="100"/>
+              <w:bottom w:type="dxa" w:w="80"/>
+              <w:right w:type="dxa" w:w="100"/>
+            </w:tcMar>
+          </w:tcPr>
+          <w:p>
+            <w:r>
+              <w:t>{exitCondition}</w:t>
+            </w:r>
+          </w:p>
+        </w:tc>
+        <w:tc>
+          <w:tcPr>
+            <w:tcW w:type="dxa" w:w="1500"/>
+            <w:tcMar>
+              <w:top w:type="dxa" w:w="80"/>
+              <w:left w:type="dxa" w:w="100"/>
+              <w:bottom w:type="dxa" w:w="80"/>
+              <w:right w:type="dxa" w:w="100"/>
+            </w:tcMar>
+          </w:tcPr>
+          <w:p>
+            <w:r>
+              <w:t>{status}{/gates}</w:t>
+            </w:r>
+          </w:p>
+        </w:tc>
+      </w:tr>
+    </w:tbl>
     <w:sectPr>
       <w:pgSz w:w="12240" w:h="15840" w:orient="portrait"/>
       <w:pgMar w:top="1080" w:right="1080" w:bottom="1080" w:left="1080" w:header="708" w:footer="708" w:gutter="0"/>

</xml_diff>

<commit_message>
Update PM Plan MIlestone
</commit_message>
<xml_diff>
--- a/templates/pmp-plan-template.docx
+++ b/templates/pmp-plan-template.docx
@@ -2492,7 +2492,7 @@
           <w:iCs/>
           <w:color w:val="666666"/>
         </w:rPr>
-        <w:t xml:space="preserve">Sourced from the Delivery tab's milestones, framed as the contractual acceptance baseline.</w:t>
+        <w:t xml:space="preserve">The contractual acceptance baseline: what gets delivered, and what evidence proves it's done.</w:t>
       </w:r>
     </w:p>
     <w:tbl>
@@ -2508,16 +2508,15 @@
         </w:tblBorders>
       </w:tblPr>
       <w:tblGrid>
-        <w:gridCol w:w="2200"/>
-        <w:gridCol w:w="1100"/>
-        <w:gridCol w:w="3200"/>
-        <w:gridCol w:w="1300"/>
+        <w:gridCol w:w="2600"/>
+        <w:gridCol w:w="3600"/>
+        <w:gridCol w:w="1600"/>
         <w:gridCol w:w="1200"/>
       </w:tblGrid>
       <w:tr>
         <w:tc>
           <w:tcPr>
-            <w:tcW w:type="dxa" w:w="2200"/>
+            <w:tcW w:type="dxa" w:w="2600"/>
             <w:shd w:fill="1F3864" w:color="auto" w:val="clear"/>
             <w:tcMar>
               <w:top w:type="dxa" w:w="80"/>
@@ -2541,31 +2540,7 @@
         </w:tc>
         <w:tc>
           <w:tcPr>
-            <w:tcW w:type="dxa" w:w="1100"/>
-            <w:shd w:fill="1F3864" w:color="auto" w:val="clear"/>
-            <w:tcMar>
-              <w:top w:type="dxa" w:w="80"/>
-              <w:left w:type="dxa" w:w="100"/>
-              <w:bottom w:type="dxa" w:w="80"/>
-              <w:right w:type="dxa" w:w="100"/>
-            </w:tcMar>
-          </w:tcPr>
-          <w:p>
-            <w:r>
-              <w:rPr>
-                <w:b/>
-                <w:bCs/>
-                <w:i w:val="false"/>
-                <w:iCs w:val="false"/>
-                <w:color w:val="FFFFFF"/>
-              </w:rPr>
-              <w:t xml:space="preserve">Type</w:t>
-            </w:r>
-          </w:p>
-        </w:tc>
-        <w:tc>
-          <w:tcPr>
-            <w:tcW w:type="dxa" w:w="3200"/>
+            <w:tcW w:type="dxa" w:w="3600"/>
             <w:shd w:fill="1F3864" w:color="auto" w:val="clear"/>
             <w:tcMar>
               <w:top w:type="dxa" w:w="80"/>
@@ -2589,7 +2564,7 @@
         </w:tc>
         <w:tc>
           <w:tcPr>
-            <w:tcW w:type="dxa" w:w="1300"/>
+            <w:tcW w:type="dxa" w:w="1600"/>
             <w:shd w:fill="1F3864" w:color="auto" w:val="clear"/>
             <w:tcMar>
               <w:top w:type="dxa" w:w="80"/>
@@ -2639,55 +2614,39 @@
       <w:tr>
         <w:tc>
           <w:tcPr>
-            <w:tcW w:type="dxa" w:w="2200"/>
-            <w:tcMar>
-              <w:top w:type="dxa" w:w="80"/>
-              <w:left w:type="dxa" w:w="100"/>
-              <w:bottom w:type="dxa" w:w="80"/>
-              <w:right w:type="dxa" w:w="100"/>
-            </w:tcMar>
-          </w:tcPr>
-          <w:p>
-            <w:r>
-              <w:t>{#deliverables}{name}</w:t>
-            </w:r>
-          </w:p>
-        </w:tc>
-        <w:tc>
-          <w:tcPr>
-            <w:tcW w:type="dxa" w:w="1100"/>
-            <w:tcMar>
-              <w:top w:type="dxa" w:w="80"/>
-              <w:left w:type="dxa" w:w="100"/>
-              <w:bottom w:type="dxa" w:w="80"/>
-              <w:right w:type="dxa" w:w="100"/>
-            </w:tcMar>
-          </w:tcPr>
-          <w:p>
-            <w:r>
-              <w:t>{type}</w:t>
-            </w:r>
-          </w:p>
-        </w:tc>
-        <w:tc>
-          <w:tcPr>
-            <w:tcW w:type="dxa" w:w="3200"/>
-            <w:tcMar>
-              <w:top w:type="dxa" w:w="80"/>
-              <w:left w:type="dxa" w:w="100"/>
-              <w:bottom w:type="dxa" w:w="80"/>
-              <w:right w:type="dxa" w:w="100"/>
-            </w:tcMar>
-          </w:tcPr>
-          <w:p>
-            <w:r>
-              <w:t>{acceptanceCriteria}</w:t>
-            </w:r>
-          </w:p>
-        </w:tc>
-        <w:tc>
-          <w:tcPr>
-            <w:tcW w:type="dxa" w:w="1300"/>
+            <w:tcW w:type="dxa" w:w="2600"/>
+            <w:tcMar>
+              <w:top w:type="dxa" w:w="80"/>
+              <w:left w:type="dxa" w:w="100"/>
+              <w:bottom w:type="dxa" w:w="80"/>
+              <w:right w:type="dxa" w:w="100"/>
+            </w:tcMar>
+          </w:tcPr>
+          <w:p>
+            <w:r>
+              <w:t>{#deliverables}{deliverable}</w:t>
+            </w:r>
+          </w:p>
+        </w:tc>
+        <w:tc>
+          <w:tcPr>
+            <w:tcW w:type="dxa" w:w="3600"/>
+            <w:tcMar>
+              <w:top w:type="dxa" w:w="80"/>
+              <w:left w:type="dxa" w:w="100"/>
+              <w:bottom w:type="dxa" w:w="80"/>
+              <w:right w:type="dxa" w:w="100"/>
+            </w:tcMar>
+          </w:tcPr>
+          <w:p>
+            <w:r>
+              <w:t>{acceptanceEvidence}</w:t>
+            </w:r>
+          </w:p>
+        </w:tc>
+        <w:tc>
+          <w:tcPr>
+            <w:tcW w:type="dxa" w:w="1600"/>
             <w:tcMar>
               <w:top w:type="dxa" w:w="80"/>
               <w:left w:type="dxa" w:w="100"/>
@@ -2735,7 +2694,7 @@
           <w:sz w:val="28"/>
           <w:szCs w:val="28"/>
         </w:rPr>
-        <w:t xml:space="preserve">12. Schedule &amp; Milestones</w:t>
+        <w:t xml:space="preserve">12. Milestone</w:t>
       </w:r>
     </w:p>
     <w:p>
@@ -2991,7 +2950,222 @@
           <w:sz w:val="28"/>
           <w:szCs w:val="28"/>
         </w:rPr>
-        <w:t xml:space="preserve">13. Resource &amp; Responsibility Plan</w:t>
+        <w:t xml:space="preserve">13. Timeline</w:t>
+      </w:r>
+    </w:p>
+    <w:p>
+      <w:pPr>
+        <w:spacing w:after="120" w:before="160"/>
+      </w:pPr>
+      <w:r>
+        <w:rPr>
+          <w:i/>
+          <w:iCs/>
+          <w:color w:val="666666"/>
+        </w:rPr>
+        <w:t xml:space="preserve">Project phases with their own start/end range — independent of the Milestone section above.</w:t>
+      </w:r>
+    </w:p>
+    <w:tbl>
+      <w:tblPr>
+        <w:tblW w:type="dxa" w:w="7700"/>
+        <w:tblBorders>
+          <w:top w:val="single" w:color="auto" w:sz="4"/>
+          <w:left w:val="single" w:color="auto" w:sz="4"/>
+          <w:bottom w:val="single" w:color="auto" w:sz="4"/>
+          <w:right w:val="single" w:color="auto" w:sz="4"/>
+          <w:insideH w:val="single" w:color="auto" w:sz="4"/>
+          <w:insideV w:val="single" w:color="auto" w:sz="4"/>
+        </w:tblBorders>
+      </w:tblPr>
+      <w:tblGrid>
+        <w:gridCol w:w="2600"/>
+        <w:gridCol w:w="1700"/>
+        <w:gridCol w:w="1700"/>
+        <w:gridCol w:w="1700"/>
+      </w:tblGrid>
+      <w:tr>
+        <w:tc>
+          <w:tcPr>
+            <w:tcW w:type="dxa" w:w="2600"/>
+            <w:shd w:fill="1F3864" w:color="auto" w:val="clear"/>
+            <w:tcMar>
+              <w:top w:type="dxa" w:w="80"/>
+              <w:left w:type="dxa" w:w="100"/>
+              <w:bottom w:type="dxa" w:w="80"/>
+              <w:right w:type="dxa" w:w="100"/>
+            </w:tcMar>
+          </w:tcPr>
+          <w:p>
+            <w:r>
+              <w:rPr>
+                <w:b/>
+                <w:bCs/>
+                <w:i w:val="false"/>
+                <w:iCs w:val="false"/>
+                <w:color w:val="FFFFFF"/>
+              </w:rPr>
+              <w:t xml:space="preserve">Phase</w:t>
+            </w:r>
+          </w:p>
+        </w:tc>
+        <w:tc>
+          <w:tcPr>
+            <w:tcW w:type="dxa" w:w="1700"/>
+            <w:shd w:fill="1F3864" w:color="auto" w:val="clear"/>
+            <w:tcMar>
+              <w:top w:type="dxa" w:w="80"/>
+              <w:left w:type="dxa" w:w="100"/>
+              <w:bottom w:type="dxa" w:w="80"/>
+              <w:right w:type="dxa" w:w="100"/>
+            </w:tcMar>
+          </w:tcPr>
+          <w:p>
+            <w:r>
+              <w:rPr>
+                <w:b/>
+                <w:bCs/>
+                <w:i w:val="false"/>
+                <w:iCs w:val="false"/>
+                <w:color w:val="FFFFFF"/>
+              </w:rPr>
+              <w:t xml:space="preserve">Start</w:t>
+            </w:r>
+          </w:p>
+        </w:tc>
+        <w:tc>
+          <w:tcPr>
+            <w:tcW w:type="dxa" w:w="1700"/>
+            <w:shd w:fill="1F3864" w:color="auto" w:val="clear"/>
+            <w:tcMar>
+              <w:top w:type="dxa" w:w="80"/>
+              <w:left w:type="dxa" w:w="100"/>
+              <w:bottom w:type="dxa" w:w="80"/>
+              <w:right w:type="dxa" w:w="100"/>
+            </w:tcMar>
+          </w:tcPr>
+          <w:p>
+            <w:r>
+              <w:rPr>
+                <w:b/>
+                <w:bCs/>
+                <w:i w:val="false"/>
+                <w:iCs w:val="false"/>
+                <w:color w:val="FFFFFF"/>
+              </w:rPr>
+              <w:t xml:space="preserve">End</w:t>
+            </w:r>
+          </w:p>
+        </w:tc>
+        <w:tc>
+          <w:tcPr>
+            <w:tcW w:type="dxa" w:w="1700"/>
+            <w:shd w:fill="1F3864" w:color="auto" w:val="clear"/>
+            <w:tcMar>
+              <w:top w:type="dxa" w:w="80"/>
+              <w:left w:type="dxa" w:w="100"/>
+              <w:bottom w:type="dxa" w:w="80"/>
+              <w:right w:type="dxa" w:w="100"/>
+            </w:tcMar>
+          </w:tcPr>
+          <w:p>
+            <w:r>
+              <w:rPr>
+                <w:b/>
+                <w:bCs/>
+                <w:i w:val="false"/>
+                <w:iCs w:val="false"/>
+                <w:color w:val="FFFFFF"/>
+              </w:rPr>
+              <w:t xml:space="preserve">Status</w:t>
+            </w:r>
+          </w:p>
+        </w:tc>
+      </w:tr>
+      <w:tr>
+        <w:tc>
+          <w:tcPr>
+            <w:tcW w:type="dxa" w:w="2600"/>
+            <w:tcMar>
+              <w:top w:type="dxa" w:w="80"/>
+              <w:left w:type="dxa" w:w="100"/>
+              <w:bottom w:type="dxa" w:w="80"/>
+              <w:right w:type="dxa" w:w="100"/>
+            </w:tcMar>
+          </w:tcPr>
+          <w:p>
+            <w:r>
+              <w:t>{#timeline}{phase}</w:t>
+            </w:r>
+          </w:p>
+        </w:tc>
+        <w:tc>
+          <w:tcPr>
+            <w:tcW w:type="dxa" w:w="1700"/>
+            <w:tcMar>
+              <w:top w:type="dxa" w:w="80"/>
+              <w:left w:type="dxa" w:w="100"/>
+              <w:bottom w:type="dxa" w:w="80"/>
+              <w:right w:type="dxa" w:w="100"/>
+            </w:tcMar>
+          </w:tcPr>
+          <w:p>
+            <w:r>
+              <w:t>{start}</w:t>
+            </w:r>
+          </w:p>
+        </w:tc>
+        <w:tc>
+          <w:tcPr>
+            <w:tcW w:type="dxa" w:w="1700"/>
+            <w:tcMar>
+              <w:top w:type="dxa" w:w="80"/>
+              <w:left w:type="dxa" w:w="100"/>
+              <w:bottom w:type="dxa" w:w="80"/>
+              <w:right w:type="dxa" w:w="100"/>
+            </w:tcMar>
+          </w:tcPr>
+          <w:p>
+            <w:r>
+              <w:t>{end}</w:t>
+            </w:r>
+          </w:p>
+        </w:tc>
+        <w:tc>
+          <w:tcPr>
+            <w:tcW w:type="dxa" w:w="1700"/>
+            <w:tcMar>
+              <w:top w:type="dxa" w:w="80"/>
+              <w:left w:type="dxa" w:w="100"/>
+              <w:bottom w:type="dxa" w:w="80"/>
+              <w:right w:type="dxa" w:w="100"/>
+            </w:tcMar>
+          </w:tcPr>
+          <w:p>
+            <w:r>
+              <w:t>{status}{/timeline}</w:t>
+            </w:r>
+          </w:p>
+        </w:tc>
+      </w:tr>
+    </w:tbl>
+    <w:p>
+      <w:pPr>
+        <w:pStyle w:val="Heading1"/>
+        <w:pBdr>
+          <w:bottom w:val="single" w:color="1F3864" w:sz="6" w:space="4"/>
+        </w:pBdr>
+        <w:spacing w:after="160" w:before="320"/>
+      </w:pPr>
+      <w:r>
+        <w:rPr>
+          <w:b/>
+          <w:bCs/>
+          <w:color w:val="1F3864"/>
+          <w:sz w:val="28"/>
+          <w:szCs w:val="28"/>
+        </w:rPr>
+        <w:t xml:space="preserve">14. Resource &amp; Responsibility Plan</w:t>
       </w:r>
     </w:p>
     <w:p>
@@ -3206,7 +3380,7 @@
           <w:sz w:val="28"/>
           <w:szCs w:val="28"/>
         </w:rPr>
-        <w:t xml:space="preserve">14. PMO Health &amp; Control Gates</w:t>
+        <w:t xml:space="preserve">15. PMO Health &amp; Control Gates</w:t>
       </w:r>
     </w:p>
     <w:p>

</xml_diff>

<commit_message>
Update PM Plan DOc
</commit_message>
<xml_diff>
--- a/templates/pmp-plan-template.docx
+++ b/templates/pmp-plan-template.docx
@@ -104,107 +104,6 @@
           <w:szCs w:val="28"/>
         </w:rPr>
         <w:t xml:space="preserve">1. Rationale</w:t>
-      </w:r>
-    </w:p>
-    <w:p>State the business problem or opportunity driving this project. Include:</w:p>
-    <w:p>
-      <w:pPr>
-        <w:pStyle w:val="ListParagraph"/>
-        <w:numPr>
-          <w:ilvl w:val="0"/>
-          <w:numId w:val="2"/>
-        </w:numPr>
-        <w:spacing w:after="60"/>
-      </w:pPr>
-      <w:r>
-        <w:rPr>
-          <w:b w:val="false"/>
-          <w:bCs w:val="false"/>
-        </w:rPr>
-        <w:t xml:space="preserve">Why this project is needed now</w:t>
-      </w:r>
-      <w:r>
-        <w:rPr>
-          <w:i/>
-          <w:iCs/>
-          <w:color w:val="666666"/>
-        </w:rPr>
-        <w:t xml:space="preserve"/>
-      </w:r>
-    </w:p>
-    <w:p>
-      <w:pPr>
-        <w:pStyle w:val="ListParagraph"/>
-        <w:numPr>
-          <w:ilvl w:val="0"/>
-          <w:numId w:val="2"/>
-        </w:numPr>
-        <w:spacing w:after="60"/>
-      </w:pPr>
-      <w:r>
-        <w:rPr>
-          <w:b w:val="false"/>
-          <w:bCs w:val="false"/>
-        </w:rPr>
-        <w:t xml:space="preserve">Expected business value / ROI</w:t>
-      </w:r>
-      <w:r>
-        <w:rPr>
-          <w:i/>
-          <w:iCs/>
-          <w:color w:val="666666"/>
-        </w:rPr>
-        <w:t xml:space="preserve"/>
-      </w:r>
-    </w:p>
-    <w:p>
-      <w:pPr>
-        <w:pStyle w:val="ListParagraph"/>
-        <w:numPr>
-          <w:ilvl w:val="0"/>
-          <w:numId w:val="2"/>
-        </w:numPr>
-        <w:spacing w:after="60"/>
-      </w:pPr>
-      <w:r>
-        <w:rPr>
-          <w:b w:val="false"/>
-          <w:bCs w:val="false"/>
-        </w:rPr>
-        <w:t xml:space="preserve">Consequences of not proceeding</w:t>
-      </w:r>
-      <w:r>
-        <w:rPr>
-          <w:i/>
-          <w:iCs/>
-          <w:color w:val="666666"/>
-        </w:rPr>
-        <w:t xml:space="preserve"/>
-      </w:r>
-    </w:p>
-    <w:p>
-      <w:pPr>
-        <w:pStyle w:val="ListParagraph"/>
-        <w:numPr>
-          <w:ilvl w:val="0"/>
-          <w:numId w:val="2"/>
-        </w:numPr>
-        <w:spacing w:after="60"/>
-      </w:pPr>
-      <w:r>
-        <w:rPr>
-          <w:b w:val="false"/>
-          <w:bCs w:val="false"/>
-        </w:rPr>
-        <w:t xml:space="preserve">Alignment with organizational goals</w:t>
-      </w:r>
-      <w:r>
-        <w:rPr>
-          <w:i/>
-          <w:iCs/>
-          <w:color w:val="666666"/>
-        </w:rPr>
-        <w:t xml:space="preserve"/>
       </w:r>
     </w:p>
     <w:p>

</xml_diff>